<commit_message>
Public day, Oct 30, 2026: README opens with the aim, what you get, how the model works and where it stands, the experiments we hope you run and a read-first list; the weights are public on Hugging Face, the reviewer token file is removed and fetch_weights.py needs no login; the invitation page says the repositories are public and links the v3.5 specification; specification v3.5 (Word and text) without the cloud-instance and credit items (sections 24.1, 24.5, 25, 25.1)
</commit_message>
<xml_diff>
--- a/docs/UEMA_Specs/UEMA_Spec_v3_5.docx
+++ b/docs/UEMA_Specs/UEMA_Spec_v3_5.docx
@@ -12719,7 +12719,7 @@
         <w:pStyle w:val="Heading3"/>
       </w:pPr>
       <w:r>
-        <w:t>24.1 Hardware: GCP G4 Instances (RTX PRO 6000 Blackwell)</w:t>
+        <w:t xml:space="preserve">24.1 Hardware: RTX PRO 6000 Blackwell GPUs</w:t>
       </w:r>
     </w:p>
     <w:p>
@@ -12727,7 +12727,7 @@
         <w:spacing w:after="120"/>
       </w:pPr>
       <w:r>
-        <w:t>MML uses Google Cloud G4 instances with NVIDIA RTX PRO 6000 Blackwell Server Edition GPUs (GA October 2025). These replace the RTX 4090 the spec was originally designed around.</w:t>
+        <w:t xml:space="preserve">The target GPU is the NVIDIA RTX PRO 6000 Blackwell Server Edition (GA October 2025). It replaces the RTX 4090 the spec was originally designed around.</w:t>
       </w:r>
     </w:p>
     <w:p>
@@ -12847,7 +12847,31 @@
         <w:spacing w:after="120"/>
       </w:pPr>
       <w:r>
-        <w:t>Available G4 instance types:</w:t>
+        <w:t xml:space="preserve">Development target: two GPUs. GPU 0: UE rendering + tokenizer. GPU 1: model training. More training GPUs only if a d_model increase beyond 768 is needed.</w:t>
+      </w:r>
+    </w:p>
+    <w:p>
+      <w:pPr>
+        <w:pStyle w:val="Heading3"/>
+      </w:pPr>
+      <w:r>
+        <w:t>24.2 Corrected Parameter Counts</w:t>
+      </w:r>
+    </w:p>
+    <w:p>
+      <w:pPr>
+        <w:spacing w:after="120"/>
+      </w:pPr>
+      <w:r>
+        <w:t>ERRATUM: v3.2 Section 24 stated “total_forward_model_params ~27M.” This was incorrect. The three-stage attention architecture in Section 6.1 produces 173M forward model parameters at d=768. The v3.2 estimate was based on standard single-attention transformer blocks, not the three-stage architecture the spec actually specifies.</w:t>
+      </w:r>
+    </w:p>
+    <w:p>
+      <w:pPr>
+        <w:spacing w:after="120"/>
+      </w:pPr>
+      <w:r>
+        <w:t>Verified parameter counts (d_model=768, 8 layers):</w:t>
       </w:r>
     </w:p>
     <w:p>
@@ -12861,7 +12885,7 @@
           <w:sz w:val="17"/>
           <w:szCs w:val="17"/>
         </w:rPr>
-        <w:t>Machine Type        GPUs    vCPUs    RAM         ~Monthly</w:t>
+        <w:t>Component                                           Millions</w:t>
       </w:r>
     </w:p>
     <w:p>
@@ -12875,7 +12899,7 @@
           <w:sz w:val="17"/>
           <w:szCs w:val="17"/>
         </w:rPr>
-        <w:t>g4-standard-48      1       48       180 GB      ~$3,300</w:t>
+        <w:t>Vision Encoder (Swin 4-layer, 16K patches)          28.9M</w:t>
       </w:r>
     </w:p>
     <w:p>
@@ -12889,7 +12913,7 @@
           <w:sz w:val="17"/>
           <w:szCs w:val="17"/>
         </w:rPr>
-        <w:t>g4-standard-96      2       96       360 GB      ~$6,500</w:t>
+        <w:t>Tactile Encoder (CrossPatchAttention, 200 patches)  7.1M</w:t>
       </w:r>
     </w:p>
     <w:p>
@@ -12903,7 +12927,105 @@
           <w:sz w:val="17"/>
           <w:szCs w:val="17"/>
         </w:rPr>
-        <w:t>g4-standard-192     4       192      720 GB      $13,141</w:t>
+        <w:t>Audio Encoder (Conv1d stack)                         4.1M</w:t>
+      </w:r>
+    </w:p>
+    <w:p>
+      <w:pPr>
+        <w:shd w:val="clear" w:color="auto" w:fill="F2F2F2"/>
+        <w:spacing w:after="0" w:line="220" w:lineRule="exact" w:before="0"/>
+      </w:pPr>
+      <w:r>
+        <w:rPr>
+          <w:rFonts w:ascii="Courier New" w:hAnsi="Courier New" w:cs="Courier New"/>
+          <w:sz w:val="17"/>
+          <w:szCs w:val="17"/>
+        </w:rPr>
+        <w:t>Proprioception Encoder (MLP)                         0.9M</w:t>
+      </w:r>
+    </w:p>
+    <w:p>
+      <w:pPr>
+        <w:shd w:val="clear" w:color="auto" w:fill="F2F2F2"/>
+        <w:spacing w:after="0" w:line="220" w:lineRule="exact" w:before="0"/>
+      </w:pPr>
+      <w:r>
+        <w:rPr>
+          <w:rFonts w:ascii="Courier New" w:hAnsi="Courier New" w:cs="Courier New"/>
+          <w:sz w:val="17"/>
+          <w:szCs w:val="17"/>
+        </w:rPr>
+        <w:t>Motor Command Encoder (CrossHandleAttention)         7.1M</w:t>
+      </w:r>
+    </w:p>
+    <w:p>
+      <w:pPr>
+        <w:shd w:val="clear" w:color="auto" w:fill="F2F2F2"/>
+        <w:spacing w:after="0" w:line="220" w:lineRule="exact" w:before="0"/>
+      </w:pPr>
+      <w:r>
+        <w:rPr>
+          <w:rFonts w:ascii="Courier New" w:hAnsi="Courier New" w:cs="Courier New"/>
+          <w:sz w:val="17"/>
+          <w:szCs w:val="17"/>
+        </w:rPr>
+        <w:t>Inter-Mind Encoder (SelfAttention)                   7.1M</w:t>
+      </w:r>
+    </w:p>
+    <w:p>
+      <w:pPr>
+        <w:shd w:val="clear" w:color="auto" w:fill="F2F2F2"/>
+        <w:spacing w:after="0" w:line="220" w:lineRule="exact" w:before="0"/>
+      </w:pPr>
+      <w:r>
+        <w:rPr>
+          <w:rFonts w:ascii="Courier New" w:hAnsi="Courier New" w:cs="Courier New"/>
+          <w:sz w:val="17"/>
+          <w:szCs w:val="17"/>
+        </w:rPr>
+        <w:t>Forward Model (8 three-stage blocks + 5 heads)       173.1M</w:t>
+      </w:r>
+    </w:p>
+    <w:p>
+      <w:pPr>
+        <w:shd w:val="clear" w:color="auto" w:fill="F2F2F2"/>
+        <w:spacing w:after="0" w:line="220" w:lineRule="exact" w:before="0"/>
+      </w:pPr>
+      <w:r>
+        <w:rPr>
+          <w:rFonts w:ascii="Courier New" w:hAnsi="Courier New" w:cs="Courier New"/>
+          <w:sz w:val="17"/>
+          <w:szCs w:val="17"/>
+        </w:rPr>
+        <w:t>Adaptive Motor Controller (6 layers)                 42.6M</w:t>
+      </w:r>
+    </w:p>
+    <w:p>
+      <w:pPr>
+        <w:shd w:val="clear" w:color="auto" w:fill="F2F2F2"/>
+        <w:spacing w:after="0" w:line="220" w:lineRule="exact" w:before="0"/>
+      </w:pPr>
+      <w:r>
+        <w:rPr>
+          <w:rFonts w:ascii="Courier New" w:hAnsi="Courier New" w:cs="Courier New"/>
+          <w:sz w:val="17"/>
+          <w:szCs w:val="17"/>
+        </w:rPr>
+        <w:t>Wellness Evaluators (grounded + approximate)         0.6M</w:t>
+      </w:r>
+    </w:p>
+    <w:p>
+      <w:pPr>
+        <w:shd w:val="clear" w:color="auto" w:fill="F2F2F2"/>
+        <w:spacing w:after="0" w:line="220" w:lineRule="exact" w:before="0"/>
+      </w:pPr>
+      <w:r>
+        <w:rPr>
+          <w:rFonts w:ascii="Courier New" w:hAnsi="Courier New" w:cs="Courier New"/>
+          <w:sz w:val="17"/>
+          <w:szCs w:val="17"/>
+        </w:rPr>
+        <w:t>ALL ENCODERS                                         55.3M</w:t>
       </w:r>
     </w:p>
     <w:p>
@@ -12917,7 +13039,7 @@
           <w:sz w:val="17"/>
           <w:szCs w:val="17"/>
         </w:rPr>
-        <w:t>g4-standard-384     8       384      1,440 GB    ~$26,000</w:t>
+        <w:t>TOTAL TRAINABLE                                      ~271M</w:t>
       </w:r>
     </w:p>
     <w:p>
@@ -12925,7 +13047,15 @@
         <w:spacing w:after="120"/>
       </w:pPr>
       <w:r>
-        <w:t>CPU: AMD Turin (EPYC 9005). Interconnect: Google custom P2P over PCIe Gen 5. NVLink is NOT available. Ratio: 48 vCPU per GPU.</w:t>
+        <w:t>VRAM: mixed-precision Adam + gradient checkpointing = 4.3 GB. A single 96 GB GPU holds this model with 95% VRAM unused. Multi-GPU is needed for FLOPS, not memory.</w:t>
+      </w:r>
+    </w:p>
+    <w:p>
+      <w:pPr>
+        <w:pStyle w:val="Heading3"/>
+      </w:pPr>
+      <w:r>
+        <w:t>24.3 Vision Encoder is 96% of Compute</w:t>
       </w:r>
     </w:p>
     <w:p>
@@ -12933,7 +13063,77 @@
         <w:spacing w:after="120"/>
       </w:pPr>
       <w:r>
-        <w:t>Development target: g4-standard-96 (2 GPUs, 96 vCPUs, 360 GB RAM). GPU 0: UE rendering + tokenizer. GPU 1: model training. Upgrade to g4-standard-192 only if d_model increase beyond 768 is needed.</w:t>
+        <w:t>Per-call FLOPS breakdown (d=768, 8 layers):</w:t>
+      </w:r>
+    </w:p>
+    <w:p>
+      <w:pPr>
+        <w:shd w:val="clear" w:color="auto" w:fill="F2F2F2"/>
+        <w:spacing w:after="0" w:line="220" w:lineRule="exact" w:before="80"/>
+      </w:pPr>
+      <w:r>
+        <w:rPr>
+          <w:rFonts w:ascii="Courier New" w:hAnsi="Courier New" w:cs="Courier New"/>
+          <w:sz w:val="17"/>
+          <w:szCs w:val="17"/>
+        </w:rPr>
+        <w:t>Component                                    GFLOPS / call    % of total</w:t>
+      </w:r>
+    </w:p>
+    <w:p>
+      <w:pPr>
+        <w:shd w:val="clear" w:color="auto" w:fill="F2F2F2"/>
+        <w:spacing w:after="0" w:line="220" w:lineRule="exact" w:before="0"/>
+      </w:pPr>
+      <w:r>
+        <w:rPr>
+          <w:rFonts w:ascii="Courier New" w:hAnsi="Courier New" w:cs="Courier New"/>
+          <w:sz w:val="17"/>
+          <w:szCs w:val="17"/>
+        </w:rPr>
+        <w:t>Vision Encoder (Swin, 16K patches)           945              96.3%</w:t>
+      </w:r>
+    </w:p>
+    <w:p>
+      <w:pPr>
+        <w:shd w:val="clear" w:color="auto" w:fill="F2F2F2"/>
+        <w:spacing w:after="0" w:line="220" w:lineRule="exact" w:before="0"/>
+      </w:pPr>
+      <w:r>
+        <w:rPr>
+          <w:rFonts w:ascii="Courier New" w:hAnsi="Courier New" w:cs="Courier New"/>
+          <w:sz w:val="17"/>
+          <w:szCs w:val="17"/>
+        </w:rPr>
+        <w:t>Forward Model (8 blocks, 192 tokens)         34               3.5%</w:t>
+      </w:r>
+    </w:p>
+    <w:p>
+      <w:pPr>
+        <w:shd w:val="clear" w:color="auto" w:fill="F2F2F2"/>
+        <w:spacing w:after="0" w:line="220" w:lineRule="exact" w:before="0"/>
+      </w:pPr>
+      <w:r>
+        <w:rPr>
+          <w:rFonts w:ascii="Courier New" w:hAnsi="Courier New" w:cs="Courier New"/>
+          <w:sz w:val="17"/>
+          <w:szCs w:val="17"/>
+        </w:rPr>
+        <w:t>All other encoders + motor + wellness        2.5              0.3%</w:t>
+      </w:r>
+    </w:p>
+    <w:p>
+      <w:pPr>
+        <w:shd w:val="clear" w:color="auto" w:fill="F2F2F2"/>
+        <w:spacing w:after="80" w:line="220" w:lineRule="exact" w:before="0"/>
+      </w:pPr>
+      <w:r>
+        <w:rPr>
+          <w:rFonts w:ascii="Courier New" w:hAnsi="Courier New" w:cs="Courier New"/>
+          <w:sz w:val="17"/>
+          <w:szCs w:val="17"/>
+        </w:rPr>
+        <w:t>TOTAL per frame (all @ 60 Hz)                982              100%</w:t>
       </w:r>
     </w:p>
     <w:p>
@@ -12941,7 +13141,7 @@
         <w:pStyle w:val="Heading3"/>
       </w:pPr>
       <w:r>
-        <w:t>24.2 Corrected Parameter Counts</w:t>
+        <w:t>24.4 Split-Rate Modality Architecture</w:t>
       </w:r>
     </w:p>
     <w:p>
@@ -12949,7 +13149,7 @@
         <w:spacing w:after="120"/>
       </w:pPr>
       <w:r>
-        <w:t>ERRATUM: v3.2 Section 24 stated “total_forward_model_params ~27M.” This was incorrect. The three-stage attention architecture in Section 6.1 produces 173M forward model parameters at d=768. The v3.2 estimate was based on standard single-attention transformer blocks, not the three-stage architecture the spec actually specifies.</w:t>
+        <w:t>Decision: vision encoder runs at 24 Hz. All other encoders and the forward model run at 60 Hz.</w:t>
       </w:r>
     </w:p>
     <w:p>
@@ -12957,7 +13157,23 @@
         <w:spacing w:after="120"/>
       </w:pPr>
       <w:r>
-        <w:t>Verified parameter counts (d_model=768, 8 layers):</w:t>
+        <w:t>Human visual cortex object recognition (V4/IT) operates at 20–30 Hz. Film looks smooth at 24 FPS. The UEMA vision encoder performs SwinTransformer scene understanding, which maps to V4/IT processing. Running it at 60 Hz was never biologically motivated and is 96% of compute cost.</w:t>
+      </w:r>
+    </w:p>
+    <w:p>
+      <w:pPr>
+        <w:spacing w:after="120"/>
+      </w:pPr>
+      <w:r>
+        <w:t>Proprioception, tactile, and motor benefit from 60 Hz: muscle spindle afferents fire at ~100 Hz, mechanoreceptors up to 300 Hz, motor control loop runs at 50–100 Hz.</w:t>
+      </w:r>
+    </w:p>
+    <w:p>
+      <w:pPr>
+        <w:spacing w:after="120"/>
+      </w:pPr>
+      <w:r>
+        <w:t>Forward model input pattern at 24 Hz vision / 60 Hz other:</w:t>
       </w:r>
     </w:p>
     <w:p>
@@ -12971,7 +13187,7 @@
           <w:sz w:val="17"/>
           <w:szCs w:val="17"/>
         </w:rPr>
-        <w:t>Component                                           Millions</w:t>
+        <w:t>Frame:  1    2    3    4    5    6    7    8    9   10</w:t>
       </w:r>
     </w:p>
     <w:p>
@@ -12985,7 +13201,7 @@
           <w:sz w:val="17"/>
           <w:szCs w:val="17"/>
         </w:rPr>
-        <w:t>Vision Encoder (Swin 4-layer, 16K patches)          28.9M</w:t>
+        <w:t>Vis:   [V1] [V1] [V1] [V2] [V2] [V3] [V3] [V3] [V4] [V4]</w:t>
       </w:r>
     </w:p>
     <w:p>
@@ -12999,7 +13215,7 @@
           <w:sz w:val="17"/>
           <w:szCs w:val="17"/>
         </w:rPr>
-        <w:t>Tactile Encoder (CrossPatchAttention, 200 patches)  7.1M</w:t>
+        <w:t>Tact:  [T1] [T2] [T3] [T4] [T5] [T6] [T7] [T8] [T9] [T10]</w:t>
       </w:r>
     </w:p>
     <w:p>
@@ -13013,13 +13229,13 @@
           <w:sz w:val="17"/>
           <w:szCs w:val="17"/>
         </w:rPr>
-        <w:t>Audio Encoder (Conv1d stack)                         4.1M</w:t>
-      </w:r>
-    </w:p>
-    <w:p>
-      <w:pPr>
-        <w:shd w:val="clear" w:color="auto" w:fill="F2F2F2"/>
-        <w:spacing w:after="0" w:line="220" w:lineRule="exact" w:before="0"/>
+        <w:t>Prop:  [P1] [P2] [P3] [P4] [P5] [P6] [P7] [P8] [P9] [P10]</w:t>
+      </w:r>
+    </w:p>
+    <w:p>
+      <w:pPr>
+        <w:shd w:val="clear" w:color="auto" w:fill="F2F2F2"/>
+        <w:spacing w:after="80" w:line="220" w:lineRule="exact" w:before="0"/>
       </w:pPr>
       <w:r>
         <w:rPr>
@@ -13027,105 +13243,7 @@
           <w:sz w:val="17"/>
           <w:szCs w:val="17"/>
         </w:rPr>
-        <w:t>Proprioception Encoder (MLP)                         0.9M</w:t>
-      </w:r>
-    </w:p>
-    <w:p>
-      <w:pPr>
-        <w:shd w:val="clear" w:color="auto" w:fill="F2F2F2"/>
-        <w:spacing w:after="0" w:line="220" w:lineRule="exact" w:before="0"/>
-      </w:pPr>
-      <w:r>
-        <w:rPr>
-          <w:rFonts w:ascii="Courier New" w:hAnsi="Courier New" w:cs="Courier New"/>
-          <w:sz w:val="17"/>
-          <w:szCs w:val="17"/>
-        </w:rPr>
-        <w:t>Motor Command Encoder (CrossHandleAttention)         7.1M</w:t>
-      </w:r>
-    </w:p>
-    <w:p>
-      <w:pPr>
-        <w:shd w:val="clear" w:color="auto" w:fill="F2F2F2"/>
-        <w:spacing w:after="0" w:line="220" w:lineRule="exact" w:before="0"/>
-      </w:pPr>
-      <w:r>
-        <w:rPr>
-          <w:rFonts w:ascii="Courier New" w:hAnsi="Courier New" w:cs="Courier New"/>
-          <w:sz w:val="17"/>
-          <w:szCs w:val="17"/>
-        </w:rPr>
-        <w:t>Inter-Mind Encoder (SelfAttention)                   7.1M</w:t>
-      </w:r>
-    </w:p>
-    <w:p>
-      <w:pPr>
-        <w:shd w:val="clear" w:color="auto" w:fill="F2F2F2"/>
-        <w:spacing w:after="0" w:line="220" w:lineRule="exact" w:before="0"/>
-      </w:pPr>
-      <w:r>
-        <w:rPr>
-          <w:rFonts w:ascii="Courier New" w:hAnsi="Courier New" w:cs="Courier New"/>
-          <w:sz w:val="17"/>
-          <w:szCs w:val="17"/>
-        </w:rPr>
-        <w:t>Forward Model (8 three-stage blocks + 5 heads)       173.1M</w:t>
-      </w:r>
-    </w:p>
-    <w:p>
-      <w:pPr>
-        <w:shd w:val="clear" w:color="auto" w:fill="F2F2F2"/>
-        <w:spacing w:after="0" w:line="220" w:lineRule="exact" w:before="0"/>
-      </w:pPr>
-      <w:r>
-        <w:rPr>
-          <w:rFonts w:ascii="Courier New" w:hAnsi="Courier New" w:cs="Courier New"/>
-          <w:sz w:val="17"/>
-          <w:szCs w:val="17"/>
-        </w:rPr>
-        <w:t>Adaptive Motor Controller (6 layers)                 42.6M</w:t>
-      </w:r>
-    </w:p>
-    <w:p>
-      <w:pPr>
-        <w:shd w:val="clear" w:color="auto" w:fill="F2F2F2"/>
-        <w:spacing w:after="0" w:line="220" w:lineRule="exact" w:before="0"/>
-      </w:pPr>
-      <w:r>
-        <w:rPr>
-          <w:rFonts w:ascii="Courier New" w:hAnsi="Courier New" w:cs="Courier New"/>
-          <w:sz w:val="17"/>
-          <w:szCs w:val="17"/>
-        </w:rPr>
-        <w:t>Wellness Evaluators (grounded + approximate)         0.6M</w:t>
-      </w:r>
-    </w:p>
-    <w:p>
-      <w:pPr>
-        <w:shd w:val="clear" w:color="auto" w:fill="F2F2F2"/>
-        <w:spacing w:after="0" w:line="220" w:lineRule="exact" w:before="0"/>
-      </w:pPr>
-      <w:r>
-        <w:rPr>
-          <w:rFonts w:ascii="Courier New" w:hAnsi="Courier New" w:cs="Courier New"/>
-          <w:sz w:val="17"/>
-          <w:szCs w:val="17"/>
-        </w:rPr>
-        <w:t>ALL ENCODERS                                         55.3M</w:t>
-      </w:r>
-    </w:p>
-    <w:p>
-      <w:pPr>
-        <w:shd w:val="clear" w:color="auto" w:fill="F2F2F2"/>
-        <w:spacing w:after="80" w:line="220" w:lineRule="exact" w:before="0"/>
-      </w:pPr>
-      <w:r>
-        <w:rPr>
-          <w:rFonts w:ascii="Courier New" w:hAnsi="Courier New" w:cs="Courier New"/>
-          <w:sz w:val="17"/>
-          <w:szCs w:val="17"/>
-        </w:rPr>
-        <w:t>TOTAL TRAINABLE                                      ~271M</w:t>
+        <w:t>Motor: [M1] [M2] [M3] [M4] [M5] [M6] [M7] [M8] [M9] [M10]</w:t>
       </w:r>
     </w:p>
     <w:p>
@@ -13133,7 +13251,7 @@
         <w:spacing w:after="120"/>
       </w:pPr>
       <w:r>
-        <w:t>VRAM: mixed-precision Adam + gradient checkpointing = 4.3 GB. A single 96 GB GPU holds this model with 95% VRAM unused. Multi-GPU is needed for FLOPS, not memory.</w:t>
+        <w:t>The forward model reuses the latest z_vision token for frames between vision updates. Its temporal attention learns that vision updates are slower. The cross-modal bridge learns to weight tactile and proprioception more heavily during fast-changing situations. This is more biologically faithful than running all modalities at the same rate.</w:t>
       </w:r>
     </w:p>
     <w:p>
@@ -13141,7 +13259,7 @@
         <w:pStyle w:val="Heading3"/>
       </w:pPr>
       <w:r>
-        <w:t>24.3 Vision Encoder is 96% of Compute</w:t>
+        <w:t>24.5 GPU Allocation and Real-Time Feasibility</w:t>
       </w:r>
     </w:p>
     <w:p>
@@ -13149,211 +13267,7 @@
         <w:spacing w:after="120"/>
       </w:pPr>
       <w:r>
-        <w:t>Per-call FLOPS breakdown (d=768, 8 layers):</w:t>
-      </w:r>
-    </w:p>
-    <w:p>
-      <w:pPr>
-        <w:shd w:val="clear" w:color="auto" w:fill="F2F2F2"/>
-        <w:spacing w:after="0" w:line="220" w:lineRule="exact" w:before="80"/>
-      </w:pPr>
-      <w:r>
-        <w:rPr>
-          <w:rFonts w:ascii="Courier New" w:hAnsi="Courier New" w:cs="Courier New"/>
-          <w:sz w:val="17"/>
-          <w:szCs w:val="17"/>
-        </w:rPr>
-        <w:t>Component                                    GFLOPS / call    % of total</w:t>
-      </w:r>
-    </w:p>
-    <w:p>
-      <w:pPr>
-        <w:shd w:val="clear" w:color="auto" w:fill="F2F2F2"/>
-        <w:spacing w:after="0" w:line="220" w:lineRule="exact" w:before="0"/>
-      </w:pPr>
-      <w:r>
-        <w:rPr>
-          <w:rFonts w:ascii="Courier New" w:hAnsi="Courier New" w:cs="Courier New"/>
-          <w:sz w:val="17"/>
-          <w:szCs w:val="17"/>
-        </w:rPr>
-        <w:t>Vision Encoder (Swin, 16K patches)           945              96.3%</w:t>
-      </w:r>
-    </w:p>
-    <w:p>
-      <w:pPr>
-        <w:shd w:val="clear" w:color="auto" w:fill="F2F2F2"/>
-        <w:spacing w:after="0" w:line="220" w:lineRule="exact" w:before="0"/>
-      </w:pPr>
-      <w:r>
-        <w:rPr>
-          <w:rFonts w:ascii="Courier New" w:hAnsi="Courier New" w:cs="Courier New"/>
-          <w:sz w:val="17"/>
-          <w:szCs w:val="17"/>
-        </w:rPr>
-        <w:t>Forward Model (8 blocks, 192 tokens)         34               3.5%</w:t>
-      </w:r>
-    </w:p>
-    <w:p>
-      <w:pPr>
-        <w:shd w:val="clear" w:color="auto" w:fill="F2F2F2"/>
-        <w:spacing w:after="0" w:line="220" w:lineRule="exact" w:before="0"/>
-      </w:pPr>
-      <w:r>
-        <w:rPr>
-          <w:rFonts w:ascii="Courier New" w:hAnsi="Courier New" w:cs="Courier New"/>
-          <w:sz w:val="17"/>
-          <w:szCs w:val="17"/>
-        </w:rPr>
-        <w:t>All other encoders + motor + wellness        2.5              0.3%</w:t>
-      </w:r>
-    </w:p>
-    <w:p>
-      <w:pPr>
-        <w:shd w:val="clear" w:color="auto" w:fill="F2F2F2"/>
-        <w:spacing w:after="80" w:line="220" w:lineRule="exact" w:before="0"/>
-      </w:pPr>
-      <w:r>
-        <w:rPr>
-          <w:rFonts w:ascii="Courier New" w:hAnsi="Courier New" w:cs="Courier New"/>
-          <w:sz w:val="17"/>
-          <w:szCs w:val="17"/>
-        </w:rPr>
-        <w:t>TOTAL per frame (all @ 60 Hz)                982              100%</w:t>
-      </w:r>
-    </w:p>
-    <w:p>
-      <w:pPr>
-        <w:pStyle w:val="Heading3"/>
-      </w:pPr>
-      <w:r>
-        <w:t>24.4 Split-Rate Modality Architecture</w:t>
-      </w:r>
-    </w:p>
-    <w:p>
-      <w:pPr>
-        <w:spacing w:after="120"/>
-      </w:pPr>
-      <w:r>
-        <w:t>Decision: vision encoder runs at 24 Hz. All other encoders and the forward model run at 60 Hz.</w:t>
-      </w:r>
-    </w:p>
-    <w:p>
-      <w:pPr>
-        <w:spacing w:after="120"/>
-      </w:pPr>
-      <w:r>
-        <w:t>Human visual cortex object recognition (V4/IT) operates at 20–30 Hz. Film looks smooth at 24 FPS. The UEMA vision encoder performs SwinTransformer scene understanding, which maps to V4/IT processing. Running it at 60 Hz was never biologically motivated and is 96% of compute cost.</w:t>
-      </w:r>
-    </w:p>
-    <w:p>
-      <w:pPr>
-        <w:spacing w:after="120"/>
-      </w:pPr>
-      <w:r>
-        <w:t>Proprioception, tactile, and motor benefit from 60 Hz: muscle spindle afferents fire at ~100 Hz, mechanoreceptors up to 300 Hz, motor control loop runs at 50–100 Hz.</w:t>
-      </w:r>
-    </w:p>
-    <w:p>
-      <w:pPr>
-        <w:spacing w:after="120"/>
-      </w:pPr>
-      <w:r>
-        <w:t>Forward model input pattern at 24 Hz vision / 60 Hz other:</w:t>
-      </w:r>
-    </w:p>
-    <w:p>
-      <w:pPr>
-        <w:shd w:val="clear" w:color="auto" w:fill="F2F2F2"/>
-        <w:spacing w:after="0" w:line="220" w:lineRule="exact" w:before="80"/>
-      </w:pPr>
-      <w:r>
-        <w:rPr>
-          <w:rFonts w:ascii="Courier New" w:hAnsi="Courier New" w:cs="Courier New"/>
-          <w:sz w:val="17"/>
-          <w:szCs w:val="17"/>
-        </w:rPr>
-        <w:t>Frame:  1    2    3    4    5    6    7    8    9   10</w:t>
-      </w:r>
-    </w:p>
-    <w:p>
-      <w:pPr>
-        <w:shd w:val="clear" w:color="auto" w:fill="F2F2F2"/>
-        <w:spacing w:after="0" w:line="220" w:lineRule="exact" w:before="0"/>
-      </w:pPr>
-      <w:r>
-        <w:rPr>
-          <w:rFonts w:ascii="Courier New" w:hAnsi="Courier New" w:cs="Courier New"/>
-          <w:sz w:val="17"/>
-          <w:szCs w:val="17"/>
-        </w:rPr>
-        <w:t>Vis:   [V1] [V1] [V1] [V2] [V2] [V3] [V3] [V3] [V4] [V4]</w:t>
-      </w:r>
-    </w:p>
-    <w:p>
-      <w:pPr>
-        <w:shd w:val="clear" w:color="auto" w:fill="F2F2F2"/>
-        <w:spacing w:after="0" w:line="220" w:lineRule="exact" w:before="0"/>
-      </w:pPr>
-      <w:r>
-        <w:rPr>
-          <w:rFonts w:ascii="Courier New" w:hAnsi="Courier New" w:cs="Courier New"/>
-          <w:sz w:val="17"/>
-          <w:szCs w:val="17"/>
-        </w:rPr>
-        <w:t>Tact:  [T1] [T2] [T3] [T4] [T5] [T6] [T7] [T8] [T9] [T10]</w:t>
-      </w:r>
-    </w:p>
-    <w:p>
-      <w:pPr>
-        <w:shd w:val="clear" w:color="auto" w:fill="F2F2F2"/>
-        <w:spacing w:after="0" w:line="220" w:lineRule="exact" w:before="0"/>
-      </w:pPr>
-      <w:r>
-        <w:rPr>
-          <w:rFonts w:ascii="Courier New" w:hAnsi="Courier New" w:cs="Courier New"/>
-          <w:sz w:val="17"/>
-          <w:szCs w:val="17"/>
-        </w:rPr>
-        <w:t>Prop:  [P1] [P2] [P3] [P4] [P5] [P6] [P7] [P8] [P9] [P10]</w:t>
-      </w:r>
-    </w:p>
-    <w:p>
-      <w:pPr>
-        <w:shd w:val="clear" w:color="auto" w:fill="F2F2F2"/>
-        <w:spacing w:after="80" w:line="220" w:lineRule="exact" w:before="0"/>
-      </w:pPr>
-      <w:r>
-        <w:rPr>
-          <w:rFonts w:ascii="Courier New" w:hAnsi="Courier New" w:cs="Courier New"/>
-          <w:sz w:val="17"/>
-          <w:szCs w:val="17"/>
-        </w:rPr>
-        <w:t>Motor: [M1] [M2] [M3] [M4] [M5] [M6] [M7] [M8] [M9] [M10]</w:t>
-      </w:r>
-    </w:p>
-    <w:p>
-      <w:pPr>
-        <w:spacing w:after="120"/>
-      </w:pPr>
-      <w:r>
-        <w:t>The forward model reuses the latest z_vision token for frames between vision updates. Its temporal attention learns that vision updates are slower. The cross-modal bridge learns to weight tactile and proprioception more heavily during fast-changing situations. This is more biologically faithful than running all modalities at the same rate.</w:t>
-      </w:r>
-    </w:p>
-    <w:p>
-      <w:pPr>
-        <w:pStyle w:val="Heading3"/>
-      </w:pPr>
-      <w:r>
-        <w:t>24.5 GPU Allocation and Real-Time Feasibility</w:t>
-      </w:r>
-    </w:p>
-    <w:p>
-      <w:pPr>
-        <w:spacing w:after="120"/>
-      </w:pPr>
-      <w:r>
-        <w:t>g4-standard-96 allocation:</w:t>
+        <w:t xml:space="preserve">Two-GPU allocation:</w:t>
       </w:r>
     </w:p>
     <w:p>
@@ -13763,7 +13677,7 @@
         <w:spacing w:after="120"/>
       </w:pPr>
       <w:r>
-        <w:t>At d=768, 24 Hz vision, single training GPU on g4-standard-96 (~$9/hr): 71 FPS sustained.</w:t>
+        <w:t xml:space="preserve">At d=768, 24 Hz vision, single training GPU: 71 FPS sustained.</w:t>
       </w:r>
     </w:p>
     <w:p>
@@ -13777,7 +13691,7 @@
           <w:sz w:val="17"/>
           <w:szCs w:val="17"/>
         </w:rPr>
-        <w:t>Stream                   Steps       Wall Time    Cost            Milestone</w:t>
+        <w:t xml:space="preserve">Stream                   Steps       Wall Time    Milestone</w:t>
       </w:r>
     </w:p>
     <w:p>
@@ -13791,7 +13705,7 @@
           <w:sz w:val="17"/>
           <w:szCs w:val="17"/>
         </w:rPr>
-        <w:t>Stream 1: Babbling       5M–15M      1–3 days     $216–$648       Forward model loss plateaus; body schema &gt;80%</w:t>
+        <w:t xml:space="preserve">Stream 1: Babbling       5M–15M      1–3 days     Forward model loss plateaus; body schema &gt;80%</w:t>
       </w:r>
     </w:p>
     <w:p>
@@ -13805,7 +13719,7 @@
           <w:sz w:val="17"/>
           <w:szCs w:val="17"/>
         </w:rPr>
-        <w:t>Stream 3: Imitation      10M–30M     2–5 days     $432–$1,080     Predicts sensory consequences of PH-driven actions</w:t>
+        <w:t xml:space="preserve">Stream 3: Imitation      10M–30M     2–5 days     Predicts sensory consequences of PH-driven actions</w:t>
       </w:r>
     </w:p>
     <w:p>
@@ -13819,7 +13733,7 @@
           <w:sz w:val="17"/>
           <w:szCs w:val="17"/>
         </w:rPr>
-        <w:t>Stream 4: Goal-directed  20M–100M    3–17 days    $648–$3,672     Intentional reaching via imagination rollouts</w:t>
+        <w:t xml:space="preserve">Stream 4: Goal-directed  20M–100M    3–17 days    Intentional reaching via imagination rollouts</w:t>
       </w:r>
     </w:p>
     <w:p>
@@ -13827,7 +13741,7 @@
         <w:spacing w:after="120"/>
       </w:pPr>
       <w:r>
-        <w:t>Stream 3 overlaps Stream 1 from step zero (see Section 20.4). Total to first goal-directed behavior: approximately 5–20 days, $1,000–$4,000.</w:t>
+        <w:t xml:space="preserve">Stream 3 overlaps Stream 1 from step zero (see Section 20.4). Total to first goal-directed behavior: approximately 5–20 days.</w:t>
       </w:r>
     </w:p>
     <w:p>
@@ -13835,7 +13749,7 @@
         <w:pStyle w:val="Heading3"/>
       </w:pPr>
       <w:r>
-        <w:t>25.1 Near-Term Implementation Plan</w:t>
+        <w:t xml:space="preserve">25.1 Scaling Path</w:t>
       </w:r>
     </w:p>
     <w:p>
@@ -13843,77 +13757,7 @@
         <w:spacing w:after="120"/>
       </w:pPr>
       <w:r>
-        <w:t>$1,200 GCP credit expires mid-February 2026. Plan:</w:t>
-      </w:r>
-    </w:p>
-    <w:p>
-      <w:pPr>
-        <w:shd w:val="clear" w:color="auto" w:fill="F2F2F2"/>
-        <w:spacing w:after="0" w:line="220" w:lineRule="exact" w:before="80"/>
-      </w:pPr>
-      <w:r>
-        <w:rPr>
-          <w:rFonts w:ascii="Courier New" w:hAnsi="Courier New" w:cs="Courier New"/>
-          <w:sz w:val="17"/>
-          <w:szCs w:val="17"/>
-        </w:rPr>
-        <w:t>Day      Task                                                                                Deliverable</w:t>
-      </w:r>
-    </w:p>
-    <w:p>
-      <w:pPr>
-        <w:shd w:val="clear" w:color="auto" w:fill="F2F2F2"/>
-        <w:spacing w:after="0" w:line="220" w:lineRule="exact" w:before="0"/>
-      </w:pPr>
-      <w:r>
-        <w:rPr>
-          <w:rFonts w:ascii="Courier New" w:hAnsi="Courier New" w:cs="Courier New"/>
-          <w:sz w:val="17"/>
-          <w:szCs w:val="17"/>
-        </w:rPr>
-        <w:t>1        Code model from UEMA spec: encoders, forward model, motor controller,               Training loop runs, loss computes,</w:t>
-      </w:r>
-    </w:p>
-    <w:p>
-      <w:pPr>
-        <w:shd w:val="clear" w:color="auto" w:fill="F2F2F2"/>
-        <w:spacing w:after="0" w:line="220" w:lineRule="exact" w:before="0"/>
-      </w:pPr>
-      <w:r>
-        <w:rPr>
-          <w:rFonts w:ascii="Courier New" w:hAnsi="Courier New" w:cs="Courier New"/>
-          <w:sz w:val="17"/>
-          <w:szCs w:val="17"/>
-        </w:rPr>
-        <w:t xml:space="preserve">         wellness, training loop. Wire to tokenizer outputs.                                  gradients flow.</w:t>
-      </w:r>
-    </w:p>
-    <w:p>
-      <w:pPr>
-        <w:shd w:val="clear" w:color="auto" w:fill="F2F2F2"/>
-        <w:spacing w:after="0" w:line="220" w:lineRule="exact" w:before="0"/>
-      </w:pPr>
-      <w:r>
-        <w:rPr>
-          <w:rFonts w:ascii="Courier New" w:hAnsi="Courier New" w:cs="Courier New"/>
-          <w:sz w:val="17"/>
-          <w:szCs w:val="17"/>
-        </w:rPr>
-        <w:t>2–7      Train d=768 on g4-standard-96 at 24 Hz vision.                                      ~30M training steps. Body schema</w:t>
-      </w:r>
-    </w:p>
-    <w:p>
-      <w:pPr>
-        <w:shd w:val="clear" w:color="auto" w:fill="F2F2F2"/>
-        <w:spacing w:after="80" w:line="220" w:lineRule="exact" w:before="0"/>
-      </w:pPr>
-      <w:r>
-        <w:rPr>
-          <w:rFonts w:ascii="Courier New" w:hAnsi="Courier New" w:cs="Courier New"/>
-          <w:sz w:val="17"/>
-          <w:szCs w:val="17"/>
-        </w:rPr>
-        <w:t xml:space="preserve">         Stream 1 + Stream 3 concurrent.                                                      validation. Prediction loss curves.</w:t>
+        <w:t xml:space="preserve">1. Stay at d=768, 24 Hz vision, 71 FPS on one training GPU.</w:t>
       </w:r>
     </w:p>
     <w:p>
@@ -13921,7 +13765,7 @@
         <w:spacing w:after="120"/>
       </w:pPr>
       <w:r>
-        <w:t>$1,200 at ~$9/hr = ~133 hours = ~5.5 days continuous. Budget allows full Stream 1 and substantial Stream 3 progress.</w:t>
+        <w:t xml:space="preserve">2. If prediction quality needs more capacity: 3 training GPUs → d=1024 (~480M params) at 30 Hz vision.</w:t>
       </w:r>
     </w:p>
     <w:p>
@@ -13929,31 +13773,7 @@
         <w:spacing w:after="120"/>
       </w:pPr>
       <w:r>
-        <w:t>Scaling path after initial credit:</w:t>
-      </w:r>
-    </w:p>
-    <w:p>
-      <w:pPr>
-        <w:spacing w:after="120"/>
-      </w:pPr>
-      <w:r>
-        <w:t>1. Stay on g4-standard-96 (d=768, 24 Hz vision, 71 FPS). ~$6,500/month.</w:t>
-      </w:r>
-    </w:p>
-    <w:p>
-      <w:pPr>
-        <w:spacing w:after="120"/>
-      </w:pPr>
-      <w:r>
-        <w:t>2. If prediction quality needs more capacity: upgrade to g4-standard-192. 3 training GPUs → d=1024 (~480M params) at 30 Hz vision.</w:t>
-      </w:r>
-    </w:p>
-    <w:p>
-      <w:pPr>
-        <w:spacing w:after="120"/>
-      </w:pPr>
-      <w:r>
-        <w:t>3. For parallel experiments: two g4-standard-96 instances with FedAvg. Same cost as one g4-standard-192, cleaner isolation, A/B comparison.</w:t>
+        <w:t xml:space="preserve">3. For parallel experiments: two two-GPU machines with FedAvg; cleaner isolation, A/B comparison.</w:t>
       </w:r>
     </w:p>
     <w:p>

</xml_diff>